<commit_message>
Update resume file and portfolio changes
</commit_message>
<xml_diff>
--- a/Harshita Bakshi_Resume.docx
+++ b/Harshita Bakshi_Resume.docx
@@ -138,7 +138,25 @@
             <w:szCs w:val="18"/>
             <w:u w:val="single"/>
           </w:rPr>
-          <w:t>harshita-bakshi</w:t>
+          <w:t>harshita-b</w:t>
+        </w:r>
+        <w:r>
+          <w:rPr>
+            <w:color w:val="006FCF"/>
+            <w:sz w:val="18"/>
+            <w:szCs w:val="18"/>
+            <w:u w:val="single"/>
+          </w:rPr>
+          <w:t>a</w:t>
+        </w:r>
+        <w:r>
+          <w:rPr>
+            <w:color w:val="006FCF"/>
+            <w:sz w:val="18"/>
+            <w:szCs w:val="18"/>
+            <w:u w:val="single"/>
+          </w:rPr>
+          <w:t>kshi</w:t>
         </w:r>
         <w:proofErr w:type="spellEnd"/>
       </w:hyperlink>
@@ -158,7 +176,34 @@
             <w:szCs w:val="18"/>
             <w:u w:val="single"/>
           </w:rPr>
-          <w:t>Portfolio</w:t>
+          <w:t>Portf</w:t>
+        </w:r>
+        <w:r>
+          <w:rPr>
+            <w:color w:val="006FCF"/>
+            <w:sz w:val="18"/>
+            <w:szCs w:val="18"/>
+            <w:u w:val="single"/>
+          </w:rPr>
+          <w:t>o</w:t>
+        </w:r>
+        <w:r>
+          <w:rPr>
+            <w:color w:val="006FCF"/>
+            <w:sz w:val="18"/>
+            <w:szCs w:val="18"/>
+            <w:u w:val="single"/>
+          </w:rPr>
+          <w:t>li</w:t>
+        </w:r>
+        <w:r>
+          <w:rPr>
+            <w:color w:val="006FCF"/>
+            <w:sz w:val="18"/>
+            <w:szCs w:val="18"/>
+            <w:u w:val="single"/>
+          </w:rPr>
+          <w:t>o</w:t>
         </w:r>
       </w:hyperlink>
       <w:r>

</xml_diff>